<commit_message>
atualizacao web e api
</commit_message>
<xml_diff>
--- a/docs/GUIA - LADVET.docx
+++ b/docs/GUIA - LADVET.docx
@@ -4,11 +4,9 @@
   <w:body>
     <w:p>
       <w:pPr>
-        <w:pStyle w:val="PargrafodaLista"/>
-        <w:ind w:firstLine="696"/>
-        <w:jc w:val="both"/>
+        <w:jc w:val="center"/>
         <w:rPr>
-          <w:rFonts w:ascii="Baguet Script" w:hAnsi="Baguet Script"/>
+          <w:rFonts w:ascii="Amasis MT Pro Black" w:hAnsi="Amasis MT Pro Black"/>
           <w:color w:val="D86DCB" w:themeColor="accent5" w:themeTint="99"/>
           <w:sz w:val="48"/>
           <w:szCs w:val="48"/>
@@ -16,7 +14,7 @@
       </w:pPr>
       <w:r>
         <w:rPr>
-          <w:rFonts w:ascii="Baguet Script" w:hAnsi="Baguet Script"/>
+          <w:rFonts w:ascii="Amasis MT Pro Black" w:hAnsi="Amasis MT Pro Black"/>
           <w:color w:val="D86DCB" w:themeColor="accent5" w:themeTint="99"/>
           <w:sz w:val="48"/>
           <w:szCs w:val="48"/>
@@ -30,7 +28,6 @@
           <w:ilvl w:val="0"/>
           <w:numId w:val="2"/>
         </w:numPr>
-        <w:jc w:val="both"/>
       </w:pPr>
       <w:r>
         <w:t>O LADVET será uma plataforma desenvolvida para ser vendida e utilizada por uma única clínica veterinária, funcionando como um sistema próprio para gerenciamento de animais e processos de adoção.</w:t>
@@ -42,7 +39,6 @@
           <w:ilvl w:val="0"/>
           <w:numId w:val="2"/>
         </w:numPr>
-        <w:jc w:val="both"/>
       </w:pPr>
       <w:r>
         <w:t>O sistema contará com cadastro e login de usuários, onde no momento da criação da conta o adotante deverá preencher um formulário com informações pessoais e informações relacionadas à adoção, como:</w:t>
@@ -54,7 +50,6 @@
           <w:ilvl w:val="1"/>
           <w:numId w:val="2"/>
         </w:numPr>
-        <w:jc w:val="both"/>
       </w:pPr>
       <w:r>
         <w:t>Tipo de residência;</w:t>
@@ -66,7 +61,6 @@
           <w:ilvl w:val="1"/>
           <w:numId w:val="2"/>
         </w:numPr>
-        <w:jc w:val="both"/>
       </w:pPr>
       <w:r>
         <w:t>Espaço disponível para o animal;</w:t>
@@ -78,7 +72,6 @@
           <w:ilvl w:val="1"/>
           <w:numId w:val="2"/>
         </w:numPr>
-        <w:jc w:val="both"/>
       </w:pPr>
       <w:r>
         <w:t>Experiência anterior com animais;</w:t>
@@ -90,7 +83,6 @@
           <w:ilvl w:val="1"/>
           <w:numId w:val="2"/>
         </w:numPr>
-        <w:jc w:val="both"/>
       </w:pPr>
       <w:r>
         <w:t>Rotina e disponibilidade para cuidados.</w:t>
@@ -102,7 +94,6 @@
           <w:ilvl w:val="0"/>
           <w:numId w:val="2"/>
         </w:numPr>
-        <w:jc w:val="both"/>
       </w:pPr>
       <w:r>
         <w:t>Essas informações ficarão armazenadas no perfil do adotante e poderão ser consultadas pela clínica veterinária durante o processo de adoção, auxiliando na análise de compatibilidade entre pessoa e animal.</w:t>
@@ -114,7 +105,6 @@
           <w:ilvl w:val="0"/>
           <w:numId w:val="2"/>
         </w:numPr>
-        <w:jc w:val="both"/>
       </w:pPr>
       <w:r>
         <w:t>O cadastro também solicitará o CEP ou endereço do usuário, permitindo que o sistema busque automaticamente do usuário.</w:t>
@@ -126,7 +116,6 @@
           <w:ilvl w:val="0"/>
           <w:numId w:val="2"/>
         </w:numPr>
-        <w:jc w:val="both"/>
       </w:pPr>
       <w:r>
         <w:t>O site possuirá uma área de adoção, onde serão exibidos cards dos animais disponíveis contendo informações como foto, nome, idade, sexo e características.</w:t>
@@ -138,7 +127,6 @@
           <w:ilvl w:val="0"/>
           <w:numId w:val="2"/>
         </w:numPr>
-        <w:jc w:val="both"/>
       </w:pPr>
       <w:r>
         <w:t>O usuário poderá acessar o perfil completo do animal e demonstrar interesse pela adoção, enquanto a clínica poderá analisar o perfil do adotante antes de aprovar a solicitação.</w:t>
@@ -150,7 +138,6 @@
           <w:ilvl w:val="0"/>
           <w:numId w:val="2"/>
         </w:numPr>
-        <w:jc w:val="both"/>
       </w:pPr>
       <w:r>
         <w:t>A plataforma contará com uma área de perfil do adotante, onde serão exibidas suas informações cadastradas, histórico e respostas do formulário de adoção.</w:t>
@@ -162,7 +149,6 @@
           <w:ilvl w:val="0"/>
           <w:numId w:val="2"/>
         </w:numPr>
-        <w:jc w:val="both"/>
       </w:pPr>
       <w:r>
         <w:t>Também haverá uma área de perfil do animal, contendo informações importantes como dados do pet, características, disponibilidade para adoção e sua carteira de vacinação, permitindo o acompanhamento das vacinas e cuidados veterinários.</w:t>
@@ -174,7 +160,6 @@
           <w:ilvl w:val="0"/>
           <w:numId w:val="2"/>
         </w:numPr>
-        <w:jc w:val="both"/>
       </w:pPr>
       <w:r>
         <w:t>A clínica veterinária terá uma área administrativa para:</w:t>
@@ -186,7 +171,6 @@
           <w:ilvl w:val="1"/>
           <w:numId w:val="2"/>
         </w:numPr>
-        <w:jc w:val="both"/>
       </w:pPr>
       <w:r>
         <w:t>Cadastrar novos animais;</w:t>
@@ -198,9 +182,9 @@
           <w:ilvl w:val="1"/>
           <w:numId w:val="2"/>
         </w:numPr>
-        <w:jc w:val="both"/>
-      </w:pPr>
-      <w:r>
+      </w:pPr>
+      <w:r>
+        <w:lastRenderedPageBreak/>
         <w:t>Atualizar informações dos pets;</w:t>
       </w:r>
     </w:p>
@@ -210,10 +194,8 @@
           <w:ilvl w:val="1"/>
           <w:numId w:val="2"/>
         </w:numPr>
-        <w:jc w:val="both"/>
-      </w:pPr>
-      <w:r>
-        <w:lastRenderedPageBreak/>
+      </w:pPr>
+      <w:r>
         <w:t>Gerenciar adoções;</w:t>
       </w:r>
     </w:p>
@@ -223,7 +205,6 @@
           <w:ilvl w:val="1"/>
           <w:numId w:val="2"/>
         </w:numPr>
-        <w:jc w:val="both"/>
       </w:pPr>
       <w:r>
         <w:t>Atualizar carteiras de vacinação;</w:t>
@@ -235,7 +216,6 @@
           <w:ilvl w:val="1"/>
           <w:numId w:val="2"/>
         </w:numPr>
-        <w:jc w:val="both"/>
       </w:pPr>
       <w:r>
         <w:t>Consultar dados dos adotantes.</w:t>
@@ -247,7 +227,6 @@
           <w:ilvl w:val="0"/>
           <w:numId w:val="2"/>
         </w:numPr>
-        <w:jc w:val="both"/>
       </w:pPr>
       <w:r>
         <w:t>O sistema terá uma página de contato da clínica, facilitando a comunicação entre usuários e a instituição responsável pelo LADVET.</w:t>
@@ -259,7 +238,6 @@
           <w:ilvl w:val="0"/>
           <w:numId w:val="2"/>
         </w:numPr>
-        <w:jc w:val="both"/>
       </w:pPr>
       <w:r>
         <w:t>Também contará com uma página apresentando a história e objetivo do projeto, reforçando a importância da adoção responsável.</w:t>
@@ -271,17 +249,12 @@
           <w:ilvl w:val="0"/>
           <w:numId w:val="2"/>
         </w:numPr>
-        <w:jc w:val="both"/>
       </w:pPr>
       <w:r>
         <w:t>O objetivo do LADVET é unir tecnologia e atendimento veterinário, tornando o processo de adoção mais seguro, organizado e eficiente, além de oferecer acompanhamento dos animais mesmo após a adoção.</w:t>
       </w:r>
     </w:p>
-    <w:p>
-      <w:pPr>
-        <w:jc w:val="both"/>
-      </w:pPr>
-    </w:p>
+    <w:p/>
     <w:sectPr>
       <w:pgSz w:w="11906" w:h="16838"/>
       <w:pgMar w:top="1417" w:right="1701" w:bottom="1417" w:left="1701" w:header="708" w:footer="708" w:gutter="0"/>

</xml_diff>